<commit_message>
Dokumentácia: požiadavky bez ovládania a stavov, úrovne AI a bossovia, učenie AI, boj rozpísaný do use cases
</commit_message>
<xml_diff>
--- a/06_Dokumentacia/instalacna-prirucka.docx
+++ b/06_Dokumentacia/instalacna-prirucka.docx
@@ -348,7 +348,7 @@
         <w:pStyle w:val="Zoznamsodrkami"/>
       </w:pPr>
       <w:r>
-        <w:t>Spusti build\windows-vs\tests\stick_tests.exe a stick_ai_tests.exe – musia skončiť „Status: SUCCESS!“ (16. 10. 2026: 70/70 a 20/20 testov).</w:t>
+        <w:t>Spusti build\windows-vs\tests\stick_tests.exe a stick_ai_tests.exe – musia skončiť „Status: SUCCESS!“.</w:t>
       </w:r>
     </w:p>
     <w:p>
@@ -820,7 +820,7 @@
   <w:abstractNum w:abstractNumId="0" w15:restartNumberingAfterBreak="0">
     <w:nsid w:val="FFFFFF89"/>
     <w:multiLevelType w:val="singleLevel"/>
-    <w:tmpl w:val="E848CE70"/>
+    <w:tmpl w:val="D6087B0A"/>
     <w:lvl w:ilvl="0">
       <w:start w:val="1"/>
       <w:numFmt w:val="bullet"/>
@@ -838,7 +838,7 @@
       </w:rPr>
     </w:lvl>
   </w:abstractNum>
-  <w:num w:numId="1" w16cid:durableId="1409575642">
+  <w:num w:numId="1" w16cid:durableId="697120403">
     <w:abstractNumId w:val="0"/>
   </w:num>
 </w:numbering>
@@ -1256,7 +1256,7 @@
     <w:link w:val="Nadpis1Char"/>
     <w:uiPriority w:val="9"/>
     <w:qFormat/>
-    <w:rsid w:val="004D4652"/>
+    <w:rsid w:val="00221EAD"/>
     <w:pPr>
       <w:keepNext/>
       <w:keepLines/>
@@ -1279,7 +1279,7 @@
     <w:semiHidden/>
     <w:unhideWhenUsed/>
     <w:qFormat/>
-    <w:rsid w:val="004D4652"/>
+    <w:rsid w:val="00221EAD"/>
     <w:pPr>
       <w:keepNext/>
       <w:keepLines/>
@@ -1302,7 +1302,7 @@
     <w:semiHidden/>
     <w:unhideWhenUsed/>
     <w:qFormat/>
-    <w:rsid w:val="004D4652"/>
+    <w:rsid w:val="00221EAD"/>
     <w:pPr>
       <w:keepNext/>
       <w:keepLines/>
@@ -1325,7 +1325,7 @@
     <w:semiHidden/>
     <w:unhideWhenUsed/>
     <w:qFormat/>
-    <w:rsid w:val="004D4652"/>
+    <w:rsid w:val="00221EAD"/>
     <w:pPr>
       <w:keepNext/>
       <w:keepLines/>
@@ -1348,7 +1348,7 @@
     <w:semiHidden/>
     <w:unhideWhenUsed/>
     <w:qFormat/>
-    <w:rsid w:val="004D4652"/>
+    <w:rsid w:val="00221EAD"/>
     <w:pPr>
       <w:keepNext/>
       <w:keepLines/>
@@ -1369,7 +1369,7 @@
     <w:semiHidden/>
     <w:unhideWhenUsed/>
     <w:qFormat/>
-    <w:rsid w:val="004D4652"/>
+    <w:rsid w:val="00221EAD"/>
     <w:pPr>
       <w:keepNext/>
       <w:keepLines/>
@@ -1392,7 +1392,7 @@
     <w:semiHidden/>
     <w:unhideWhenUsed/>
     <w:qFormat/>
-    <w:rsid w:val="004D4652"/>
+    <w:rsid w:val="00221EAD"/>
     <w:pPr>
       <w:keepNext/>
       <w:keepLines/>
@@ -1413,7 +1413,7 @@
     <w:semiHidden/>
     <w:unhideWhenUsed/>
     <w:qFormat/>
-    <w:rsid w:val="004D4652"/>
+    <w:rsid w:val="00221EAD"/>
     <w:pPr>
       <w:keepNext/>
       <w:keepLines/>
@@ -1436,7 +1436,7 @@
     <w:semiHidden/>
     <w:unhideWhenUsed/>
     <w:qFormat/>
-    <w:rsid w:val="004D4652"/>
+    <w:rsid w:val="00221EAD"/>
     <w:pPr>
       <w:keepNext/>
       <w:keepLines/>
@@ -1480,7 +1480,7 @@
     <w:basedOn w:val="Predvolenpsmoodseku"/>
     <w:link w:val="Nadpis1"/>
     <w:uiPriority w:val="9"/>
-    <w:rsid w:val="004D4652"/>
+    <w:rsid w:val="00221EAD"/>
     <w:rPr>
       <w:rFonts w:asciiTheme="majorHAnsi" w:eastAsiaTheme="majorEastAsia" w:hAnsiTheme="majorHAnsi" w:cstheme="majorBidi"/>
       <w:color w:val="0F4761" w:themeColor="accent1" w:themeShade="BF"/>
@@ -1494,7 +1494,7 @@
     <w:link w:val="Nadpis2"/>
     <w:uiPriority w:val="9"/>
     <w:semiHidden/>
-    <w:rsid w:val="004D4652"/>
+    <w:rsid w:val="00221EAD"/>
     <w:rPr>
       <w:rFonts w:asciiTheme="majorHAnsi" w:eastAsiaTheme="majorEastAsia" w:hAnsiTheme="majorHAnsi" w:cstheme="majorBidi"/>
       <w:color w:val="0F4761" w:themeColor="accent1" w:themeShade="BF"/>
@@ -1508,7 +1508,7 @@
     <w:link w:val="Nadpis3"/>
     <w:uiPriority w:val="9"/>
     <w:semiHidden/>
-    <w:rsid w:val="004D4652"/>
+    <w:rsid w:val="00221EAD"/>
     <w:rPr>
       <w:rFonts w:eastAsiaTheme="majorEastAsia" w:cstheme="majorBidi"/>
       <w:color w:val="0F4761" w:themeColor="accent1" w:themeShade="BF"/>
@@ -1522,7 +1522,7 @@
     <w:link w:val="Nadpis4"/>
     <w:uiPriority w:val="9"/>
     <w:semiHidden/>
-    <w:rsid w:val="004D4652"/>
+    <w:rsid w:val="00221EAD"/>
     <w:rPr>
       <w:rFonts w:eastAsiaTheme="majorEastAsia" w:cstheme="majorBidi"/>
       <w:i/>
@@ -1536,7 +1536,7 @@
     <w:link w:val="Nadpis5"/>
     <w:uiPriority w:val="9"/>
     <w:semiHidden/>
-    <w:rsid w:val="004D4652"/>
+    <w:rsid w:val="00221EAD"/>
     <w:rPr>
       <w:rFonts w:eastAsiaTheme="majorEastAsia" w:cstheme="majorBidi"/>
       <w:color w:val="0F4761" w:themeColor="accent1" w:themeShade="BF"/>
@@ -1548,7 +1548,7 @@
     <w:link w:val="Nadpis6"/>
     <w:uiPriority w:val="9"/>
     <w:semiHidden/>
-    <w:rsid w:val="004D4652"/>
+    <w:rsid w:val="00221EAD"/>
     <w:rPr>
       <w:rFonts w:eastAsiaTheme="majorEastAsia" w:cstheme="majorBidi"/>
       <w:i/>
@@ -1562,7 +1562,7 @@
     <w:link w:val="Nadpis7"/>
     <w:uiPriority w:val="9"/>
     <w:semiHidden/>
-    <w:rsid w:val="004D4652"/>
+    <w:rsid w:val="00221EAD"/>
     <w:rPr>
       <w:rFonts w:eastAsiaTheme="majorEastAsia" w:cstheme="majorBidi"/>
       <w:color w:val="595959" w:themeColor="text1" w:themeTint="A6"/>
@@ -1574,7 +1574,7 @@
     <w:link w:val="Nadpis8"/>
     <w:uiPriority w:val="9"/>
     <w:semiHidden/>
-    <w:rsid w:val="004D4652"/>
+    <w:rsid w:val="00221EAD"/>
     <w:rPr>
       <w:rFonts w:eastAsiaTheme="majorEastAsia" w:cstheme="majorBidi"/>
       <w:i/>
@@ -1588,7 +1588,7 @@
     <w:link w:val="Nadpis9"/>
     <w:uiPriority w:val="9"/>
     <w:semiHidden/>
-    <w:rsid w:val="004D4652"/>
+    <w:rsid w:val="00221EAD"/>
     <w:rPr>
       <w:rFonts w:eastAsiaTheme="majorEastAsia" w:cstheme="majorBidi"/>
       <w:color w:val="272727" w:themeColor="text1" w:themeTint="D8"/>
@@ -1601,7 +1601,7 @@
     <w:link w:val="NzovChar"/>
     <w:uiPriority w:val="10"/>
     <w:qFormat/>
-    <w:rsid w:val="004D4652"/>
+    <w:rsid w:val="00221EAD"/>
     <w:pPr>
       <w:spacing w:after="80" w:line="240" w:lineRule="auto"/>
       <w:contextualSpacing/>
@@ -1619,7 +1619,7 @@
     <w:basedOn w:val="Predvolenpsmoodseku"/>
     <w:link w:val="Nzov"/>
     <w:uiPriority w:val="10"/>
-    <w:rsid w:val="004D4652"/>
+    <w:rsid w:val="00221EAD"/>
     <w:rPr>
       <w:rFonts w:asciiTheme="majorHAnsi" w:eastAsiaTheme="majorEastAsia" w:hAnsiTheme="majorHAnsi" w:cstheme="majorBidi"/>
       <w:spacing w:val="-10"/>
@@ -1635,7 +1635,7 @@
     <w:link w:val="PodtitulChar"/>
     <w:uiPriority w:val="11"/>
     <w:qFormat/>
-    <w:rsid w:val="004D4652"/>
+    <w:rsid w:val="00221EAD"/>
     <w:pPr>
       <w:numPr>
         <w:ilvl w:val="1"/>
@@ -1654,7 +1654,7 @@
     <w:basedOn w:val="Predvolenpsmoodseku"/>
     <w:link w:val="Podtitul"/>
     <w:uiPriority w:val="11"/>
-    <w:rsid w:val="004D4652"/>
+    <w:rsid w:val="00221EAD"/>
     <w:rPr>
       <w:rFonts w:eastAsiaTheme="majorEastAsia" w:cstheme="majorBidi"/>
       <w:color w:val="595959" w:themeColor="text1" w:themeTint="A6"/>
@@ -1670,7 +1670,7 @@
     <w:link w:val="CitciaChar"/>
     <w:uiPriority w:val="29"/>
     <w:qFormat/>
-    <w:rsid w:val="004D4652"/>
+    <w:rsid w:val="00221EAD"/>
     <w:pPr>
       <w:spacing w:before="160"/>
       <w:jc w:val="center"/>
@@ -1686,7 +1686,7 @@
     <w:basedOn w:val="Predvolenpsmoodseku"/>
     <w:link w:val="Citcia"/>
     <w:uiPriority w:val="29"/>
-    <w:rsid w:val="004D4652"/>
+    <w:rsid w:val="00221EAD"/>
     <w:rPr>
       <w:i/>
       <w:iCs/>
@@ -1698,7 +1698,7 @@
     <w:basedOn w:val="Normlny"/>
     <w:uiPriority w:val="34"/>
     <w:qFormat/>
-    <w:rsid w:val="004D4652"/>
+    <w:rsid w:val="00221EAD"/>
     <w:pPr>
       <w:ind w:left="720"/>
       <w:contextualSpacing/>
@@ -1709,7 +1709,7 @@
     <w:basedOn w:val="Predvolenpsmoodseku"/>
     <w:uiPriority w:val="21"/>
     <w:qFormat/>
-    <w:rsid w:val="004D4652"/>
+    <w:rsid w:val="00221EAD"/>
     <w:rPr>
       <w:i/>
       <w:iCs/>
@@ -1723,7 +1723,7 @@
     <w:link w:val="ZvraznencitciaChar"/>
     <w:uiPriority w:val="30"/>
     <w:qFormat/>
-    <w:rsid w:val="004D4652"/>
+    <w:rsid w:val="00221EAD"/>
     <w:pPr>
       <w:pBdr>
         <w:top w:val="single" w:sz="4" w:space="10" w:color="0F4761" w:themeColor="accent1" w:themeShade="BF"/>
@@ -1744,7 +1744,7 @@
     <w:basedOn w:val="Predvolenpsmoodseku"/>
     <w:link w:val="Zvraznencitcia"/>
     <w:uiPriority w:val="30"/>
-    <w:rsid w:val="004D4652"/>
+    <w:rsid w:val="00221EAD"/>
     <w:rPr>
       <w:i/>
       <w:iCs/>
@@ -1756,7 +1756,7 @@
     <w:basedOn w:val="Predvolenpsmoodseku"/>
     <w:uiPriority w:val="32"/>
     <w:qFormat/>
-    <w:rsid w:val="004D4652"/>
+    <w:rsid w:val="00221EAD"/>
     <w:rPr>
       <w:b/>
       <w:bCs/>
@@ -1770,7 +1770,7 @@
     <w:basedOn w:val="Normlny"/>
     <w:uiPriority w:val="99"/>
     <w:unhideWhenUsed/>
-    <w:rsid w:val="004D4652"/>
+    <w:rsid w:val="00221EAD"/>
     <w:pPr>
       <w:numPr>
         <w:numId w:val="1"/>

</xml_diff>